<commit_message>
feat: status 'Usuário Não Encontrado' + 3 motivos de resolução + docx de entrega
- Status 'Não Mapeado' renomeado para 'Usuário Não Encontrado' na exibição
  (código interno segue NAO_MAPEADO, sem migração); trocado em index.html,
  visualizador, gerar_saidas, testes e geradores de doc/demo
- motivos_resolucao.xml: lista fechada com 3 motivos validados pelo cliente
  (Exceção, Transferência de Área, Acesso Indevido)
- docx de entrega SYSTUR v1.0 atualizado (7 melhorias + status renomeado)

Co-Authored-By: Claude Opus 4.8 <noreply@anthropic.com>
</commit_message>
<xml_diff>
--- a/CVC_IAM_Analytics_Entrega_SYSTUR_v1.0 1.docx
+++ b/CVC_IAM_Analytics_Entrega_SYSTUR_v1.0 1.docx
@@ -3883,7 +3883,7 @@
               <w:rPr>
                 <w:rFonts w:ascii="JUST Sans" w:hAnsi="JUST Sans"/>
               </w:rPr>
-              <w:t>Não mapeado</w:t>
+              <w:t>Usuário Não Encontrado</w:t>
             </w:r>
           </w:p>
         </w:tc>
@@ -4237,7 +4237,7 @@
           <w:szCs w:val="20"/>
           <w:lang w:val="pt-BR"/>
         </w:rPr>
-        <w:t>ruza o que cada pessoa acessa com o que o cargo prevê e gera a classificação (Aderente, Incluir, Alterar, Em Análise, Não Mapeado);</w:t>
+        <w:t>ruza o que cada pessoa acessa com o que o cargo prevê e gera a classificação (Aderente, Incluir, Alterar, Em Análise, Usuário Não Encontrado);</w:t>
       </w:r>
     </w:p>
     <w:p>
@@ -6578,7 +6578,20 @@
           <w:sz w:val="20"/>
           <w:szCs w:val="20"/>
         </w:rPr>
-        <w:t>Em todas as listas você pode: buscar por texto, filtrar por qualquer coluna (clicando no título da coluna), ordenar, escolher quantos itens ver por página e exportar para Excel — e a exportação sai igual ao que está na tela, respeitando os filtros aplicados.</w:t>
+        <w:t>Em todas as listas você pode: buscar por texto, filtrar por qualquer coluna (clicando no título da coluna), ordenar, escolher quantos itens ver por página e exportar para Excel — e a exportação sai igual ao que está na tela, respeitando os filtros aplicados. Você também pode salvar filtros favoritos (atalhos), que ficam disponíveis para você em qualquer computador.</w:t>
+      </w:r>
+    </w:p>
+    <w:p>
+      <w:pPr>
+        <w:rPr>
+          <w:rFonts w:ascii="JUST Sans" w:hAnsi="JUST Sans"/>
+          <w:color w:val="000000" w:themeColor="text1"/>
+          <w:sz w:val="20"/>
+          <w:szCs w:val="20"/>
+        </w:rPr>
+      </w:pPr>
+      <w:r>
+        <w:t>No alto do painel há o link “Arquivos importados”, que mostra o último arquivo carregado de cada base e a data desse arquivo — assim você sabe sobre qual foto dos dados o painel está trabalhando.</w:t>
       </w:r>
     </w:p>
     <w:p>
@@ -6633,7 +6646,7 @@
           <w:sz w:val="20"/>
           <w:szCs w:val="20"/>
         </w:rPr>
-        <w:t>É o resumo gerencial do dia a dia. Não tem ações — é uma tela de leitura para enxergar o todo e priorizar.</w:t>
+        <w:t>É o resumo gerencial do dia a dia — uma tela de leitura para enxergar o todo e priorizar. Ela também pode ser exportada para Excel, com uma aba que espelha o painel e uma aba de análise interativa em que os gráficos se recalculam ao aplicar filtros.</w:t>
       </w:r>
     </w:p>
     <w:p>
@@ -6681,7 +6694,7 @@
           <w:szCs w:val="20"/>
           <w:lang w:val="pt-BR"/>
         </w:rPr>
-        <w:t>uantas pessoas há em cada classificação (Incluir, Alterar, Em Análise, Não Mapeado, Aderente);</w:t>
+        <w:t>uantas pessoas há em cada classificação (Incluir, Alterar, Em Análise, Usuário Não Encontrado, Aderente);</w:t>
       </w:r>
     </w:p>
     <w:p>
@@ -6805,6 +6818,20 @@
           <w:lang w:val="pt-BR"/>
         </w:rPr>
         <w:t>distribuição das pendências por tipo e por sistema;</w:t>
+      </w:r>
+    </w:p>
+    <w:p>
+      <w:pPr>
+        <w:pStyle w:val="Commarcadores"/>
+        <w:rPr>
+          <w:rFonts w:ascii="JUST Sans" w:hAnsi="JUST Sans"/>
+          <w:sz w:val="20"/>
+          <w:szCs w:val="20"/>
+          <w:lang w:val="pt-BR"/>
+        </w:rPr>
+      </w:pPr>
+      <w:r>
+        <w:t>Os motivos usados nos tratamentos, para enxergar por que as pendências foram resolvidas;</w:t>
       </w:r>
     </w:p>
     <w:p>
@@ -7255,7 +7282,7 @@
           <w:szCs w:val="20"/>
           <w:lang w:val="pt-BR"/>
         </w:rPr>
-        <w:t>iltrar por qualquer coluna (vínculo, departamento, status, tipo…) e por período;</w:t>
+        <w:t>iltrar por qualquer coluna (vínculo, departamento, status, tipo…) e por período — com atalhos rápidos (hoje, 7 dias, mês, ano) ou um intervalo personalizado;</w:t>
       </w:r>
     </w:p>
     <w:p>
@@ -7313,7 +7340,7 @@
           <w:szCs w:val="20"/>
           <w:lang w:val="pt-BR"/>
         </w:rPr>
-        <w:t>esolver uma pendência, informando o chamado e uma descrição;</w:t>
+        <w:t>esolver uma pendência, informando o chamado, o motivo (escolhido de um catálogo) e uma descrição;</w:t>
       </w:r>
     </w:p>
     <w:p>
@@ -7342,7 +7369,7 @@
           <w:szCs w:val="20"/>
           <w:lang w:val="pt-BR"/>
         </w:rPr>
-        <w:t>nviar um acesso para quarentena (observação por prazo);</w:t>
+        <w:t>nviar um acesso para quarentena por um formulário (prazo em dias, chamado, título e motivo);</w:t>
       </w:r>
     </w:p>
     <w:p>
@@ -7925,7 +7952,7 @@
           <w:sz w:val="20"/>
           <w:szCs w:val="20"/>
         </w:rPr>
-        <w:t>Acessos colocados em observação por um prazo, antes de uma decisão definitiva. Use quando precisar de um tempo para avaliar antes de agir.</w:t>
+        <w:t>Acessos colocados em observação por um prazo, antes de uma decisão definitiva. Use quando precisar de um tempo para avaliar antes de agir. Quando o prazo vence, o acesso volta automaticamente para a lista de pendências.</w:t>
       </w:r>
     </w:p>
     <w:p>
@@ -7958,6 +7985,20 @@
         </w:rPr>
       </w:pPr>
       <w:r>
+        <w:t>Colocar um acesso em quarentena por um formulário: prazo em dias, chamado, título e motivo;</w:t>
+      </w:r>
+    </w:p>
+    <w:p>
+      <w:pPr>
+        <w:pStyle w:val="Commarcadores"/>
+        <w:rPr>
+          <w:rFonts w:ascii="JUST Sans" w:hAnsi="JUST Sans"/>
+          <w:sz w:val="20"/>
+          <w:szCs w:val="20"/>
+          <w:lang w:val="pt-BR"/>
+        </w:rPr>
+      </w:pPr>
+      <w:r>
         <w:rPr>
           <w:rFonts w:ascii="JUST Sans" w:hAnsi="JUST Sans"/>
           <w:sz w:val="20"/>
@@ -7974,6 +8015,20 @@
           <w:lang w:val="pt-BR"/>
         </w:rPr>
         <w:t>er as quarentenas ativas, com os dias restantes de cada uma;</w:t>
+      </w:r>
+    </w:p>
+    <w:p>
+      <w:pPr>
+        <w:pStyle w:val="Commarcadores"/>
+        <w:rPr>
+          <w:rFonts w:ascii="JUST Sans" w:hAnsi="JUST Sans"/>
+          <w:sz w:val="20"/>
+          <w:szCs w:val="20"/>
+          <w:lang w:val="pt-BR"/>
+        </w:rPr>
+      </w:pPr>
+      <w:r>
+        <w:t>Retirar um acesso da quarentena antes do prazo, informando o motivo da retirada;</w:t>
       </w:r>
     </w:p>
     <w:p>
@@ -8416,7 +8471,7 @@
           <w:szCs w:val="20"/>
           <w:lang w:val="pt-BR"/>
         </w:rPr>
-        <w:t xml:space="preserve"> tratamento é feito por pessoa, sempre vinculado a um chamado, com uma breve descrição do que foi feito.</w:t>
+        <w:t xml:space="preserve"> tratamento é feito por pessoa, sempre vinculado a um chamado, com um motivo e uma breve descrição do que foi feito.</w:t>
       </w:r>
     </w:p>
     <w:p>
@@ -9756,7 +9811,7 @@
               <w:rPr>
                 <w:rFonts w:ascii="JUST Sans" w:hAnsi="JUST Sans"/>
               </w:rPr>
-              <w:t>Não mapeado</w:t>
+              <w:t>Usuário Não Encontrado</w:t>
             </w:r>
           </w:p>
         </w:tc>

</xml_diff>